<commit_message>
Update CTER: full pipeline, results, docs
</commit_message>
<xml_diff>
--- a/paper/CTER_paper.docx
+++ b/paper/CTER_paper.docx
@@ -13027,7 +13027,7 @@
         <w:t>decays into the tail</w:t>
       </w:r>
       <w:r>
-        <w:t>: the cross-asset mean AUC falls from 0.56 (95%) to 0.53 (97.5%) to 0.46 (99%)—below random at the deepest level (Figure </w:t>
+        <w:t>: the cross-asset mean AUC falls from 0.56 (95%) to 0.54 (97.5%) to 0.47 (99%)—below random at the deepest level (Figure </w:t>
       </w:r>
       <w:hyperlink w:anchor="fig:auc">
         <w:r>
@@ -13039,7 +13039,7 @@
         </w:r>
       </w:hyperlink>
       <w:r>
-        <w:t>). The bond market (TLT) is the exception, with AUC ≈0.66–0.67 at all levels, indicating that fixed-income episodes are more predictable than equity or crypto episodes. The two components of the decomposition therefore behave asymmetrically: the probability component is weak, while the severity target carries more predictable structure. The decomposition is thus conceptually useful even though the current conditioning set does not reliably forecast episode occurrence, and CTER should not be presented as a universal early-warning system.</w:t>
+        <w:t>). The bond market (TLT) is the exception, with AUC ≈0.64–0.67 at all levels, indicating that fixed-income episodes are more predictable than equity or crypto episodes. The two components of the decomposition therefore behave asymmetrically: the probability component is weak, while the severity target carries more predictable structure. The decomposition is thus conceptually useful even though the current conditioning set does not reliably forecast episode occurrence, and CTER should not be presented as a universal early-warning system.</w:t>
       </w:r>
     </w:p>
     <w:p>

</xml_diff>